<commit_message>
Convertendo .docx para .pdf
</commit_message>
<xml_diff>
--- a/modelo.docx
+++ b/modelo.docx
@@ -329,7 +329,25 @@
           <w:color w:val="000000"/>
           <w:shd w:val="clear" w:color="auto" w:fill="FFFFFF"/>
         </w:rPr>
-        <w:t>DISFONTE DISTRIBUIDORA DE BEBIDAS LTDA., com sede na Rua Antônio Marinho Albuquerque, nº 187, Bairro Valinhos, Passo Fundo-RS, inscrita no CNPJ sob nº 92.170.307/0001-59, entrega neste ato, ao seu funcionário acima designado, doravante denominado simplesmente de “USUÁRIO”, um aparelho Smartphone, incluindo seus acessórios</w:t>
+        <w:t xml:space="preserve">DISFONTE DISTRIBUIDORA DE BEBIDAS LTDA., com sede na Rua Antônio Marinho Albuquerque, nº 187, Bairro Valinhos, Passo </w:t>
+      </w:r>
+      <w:proofErr w:type="spellStart"/>
+      <w:r>
+        <w:rPr>
+          <w:rFonts w:ascii="Times New Roman" w:hAnsi="Times New Roman"/>
+          <w:color w:val="000000"/>
+          <w:shd w:val="clear" w:color="auto" w:fill="FFFFFF"/>
+        </w:rPr>
+        <w:t>Fundo-RS</w:t>
+      </w:r>
+      <w:proofErr w:type="spellEnd"/>
+      <w:r>
+        <w:rPr>
+          <w:rFonts w:ascii="Times New Roman" w:hAnsi="Times New Roman"/>
+          <w:color w:val="000000"/>
+          <w:shd w:val="clear" w:color="auto" w:fill="FFFFFF"/>
+        </w:rPr>
+        <w:t>, inscrita no CNPJ sob nº 92.170.307/0001-59, entrega neste ato, ao seu funcionário acima designado, doravante denominado simplesmente de “USUÁRIO”, um aparelho Smartphone, incluindo seus acessórios</w:t>
       </w:r>
       <w:r>
         <w:rPr>
@@ -512,25 +530,7 @@
           <w:color w:val="000000"/>
           <w:shd w:val="clear" w:color="auto" w:fill="FFFFFF"/>
         </w:rPr>
-        <w:t>{{</w:t>
-      </w:r>
-      <w:proofErr w:type="gramStart"/>
-      <w:r>
-        <w:rPr>
-          <w:rFonts w:ascii="Times New Roman" w:hAnsi="Times New Roman"/>
-          <w:color w:val="000000"/>
-          <w:shd w:val="clear" w:color="auto" w:fill="FFFFFF"/>
-        </w:rPr>
-        <w:t>numero</w:t>
-      </w:r>
-      <w:proofErr w:type="gramEnd"/>
-      <w:r>
-        <w:rPr>
-          <w:rFonts w:ascii="Times New Roman" w:hAnsi="Times New Roman"/>
-          <w:color w:val="000000"/>
-          <w:shd w:val="clear" w:color="auto" w:fill="FFFFFF"/>
-        </w:rPr>
-        <w:t>}}</w:t>
+        <w:t>{{numero}}</w:t>
       </w:r>
     </w:p>
     <w:p>
@@ -627,6 +627,15 @@
           <w:bCs/>
           <w:color w:val="000000"/>
         </w:rPr>
+        <w:t>R$</w:t>
+      </w:r>
+      <w:r>
+        <w:rPr>
+          <w:rFonts w:ascii="Times New Roman" w:hAnsi="Times New Roman"/>
+          <w:b/>
+          <w:bCs/>
+          <w:color w:val="000000"/>
+        </w:rPr>
         <w:t>{{valor}}</w:t>
       </w:r>
       <w:r>
@@ -838,25 +847,7 @@
           <w:shd w:val="clear" w:color="auto" w:fill="FFFFFF"/>
         </w:rPr>
         <w:lastRenderedPageBreak/>
-        <w:t xml:space="preserve">7. Se o contrato de trabalho entre as partes for encerrado o USUÁRIO deverá devolver o aparelho Smartphone (bem como seus acessórios) e a Capa para a empresa, não ficando com nenhum direito sobre os equipamentos. O USUÁRIO se compromete a devolvê-los em perfeito estado no mesmo dia em que for comunicado ou comunique seu desligamento, considerando o desgaste natural pelo uso normal dos equipamentos. Se o USUÁRIO não devolver os equipamentos, a empresa está autorizada a descontar na rescisão do contrato de trabalho os valores totais </w:t>
-      </w:r>
-      <w:proofErr w:type="gramStart"/>
-      <w:r>
-        <w:rPr>
-          <w:rFonts w:ascii="Times New Roman" w:hAnsi="Times New Roman"/>
-          <w:color w:val="000000"/>
-          <w:shd w:val="clear" w:color="auto" w:fill="FFFFFF"/>
-        </w:rPr>
-        <w:t>dos mesmos</w:t>
-      </w:r>
-      <w:proofErr w:type="gramEnd"/>
-      <w:r>
-        <w:rPr>
-          <w:rFonts w:ascii="Times New Roman" w:hAnsi="Times New Roman"/>
-          <w:color w:val="000000"/>
-          <w:shd w:val="clear" w:color="auto" w:fill="FFFFFF"/>
-        </w:rPr>
-        <w:t>, conforme descrito anteriormente.</w:t>
+        <w:t>7. Se o contrato de trabalho entre as partes for encerrado o USUÁRIO deverá devolver o aparelho Smartphone (bem como seus acessórios) e a Capa para a empresa, não ficando com nenhum direito sobre os equipamentos. O USUÁRIO se compromete a devolvê-los em perfeito estado no mesmo dia em que for comunicado ou comunique seu desligamento, considerando o desgaste natural pelo uso normal dos equipamentos. Se o USUÁRIO não devolver os equipamentos, a empresa está autorizada a descontar na rescisão do contrato de trabalho os valores totais dos mesmos, conforme descrito anteriormente.</w:t>
       </w:r>
     </w:p>
     <w:p>
@@ -1495,25 +1486,7 @@
           <w:sz w:val="22"/>
           <w:szCs w:val="22"/>
         </w:rPr>
-        <w:t xml:space="preserve">O desconto será efetuado mediante a emissão de laudo técnico pelas empresas especializadas que prestam serviço à empresa, constatado mau uso, este será repassado à área de Depto. </w:t>
-      </w:r>
-      <w:proofErr w:type="gramStart"/>
-      <w:r>
-        <w:rPr>
-          <w:rFonts w:ascii="Times New Roman" w:hAnsi="Times New Roman" w:cs="Times New Roman"/>
-          <w:sz w:val="22"/>
-          <w:szCs w:val="22"/>
-        </w:rPr>
-        <w:t>Pessoal</w:t>
-      </w:r>
-      <w:proofErr w:type="gramEnd"/>
-      <w:r>
-        <w:rPr>
-          <w:rFonts w:ascii="Times New Roman" w:hAnsi="Times New Roman" w:cs="Times New Roman"/>
-          <w:sz w:val="22"/>
-          <w:szCs w:val="22"/>
-        </w:rPr>
-        <w:t xml:space="preserve"> para proceder ao lançamento em folha de pagamento.</w:t>
+        <w:t>O desconto será efetuado mediante a emissão de laudo técnico pelas empresas especializadas que prestam serviço à empresa, constatado mau uso, este será repassado à área de Depto. Pessoal para proceder ao lançamento em folha de pagamento.</w:t>
       </w:r>
     </w:p>
     <w:p>
@@ -1581,8 +1554,7 @@
     </w:p>
     <w:tbl>
       <w:tblPr>
-        <w:tblW w:w="7141" w:type="dxa"/>
-        <w:jc w:val="center"/>
+        <w:tblW w:w="9740" w:type="dxa"/>
         <w:tblCellMar>
           <w:left w:w="70" w:type="dxa"/>
           <w:right w:w="70" w:type="dxa"/>
@@ -1590,29 +1562,28 @@
         <w:tblLook w:val="04A0" w:firstRow="1" w:lastRow="0" w:firstColumn="1" w:lastColumn="0" w:noHBand="0" w:noVBand="1"/>
       </w:tblPr>
       <w:tblGrid>
-        <w:gridCol w:w="1280"/>
-        <w:gridCol w:w="1460"/>
-        <w:gridCol w:w="1365"/>
-        <w:gridCol w:w="1038"/>
-        <w:gridCol w:w="1998"/>
+        <w:gridCol w:w="1700"/>
+        <w:gridCol w:w="1700"/>
+        <w:gridCol w:w="1748"/>
+        <w:gridCol w:w="1373"/>
+        <w:gridCol w:w="3219"/>
       </w:tblGrid>
       <w:tr>
         <w:trPr>
           <w:trHeight w:val="300"/>
-          <w:jc w:val="center"/>
         </w:trPr>
         <w:tc>
           <w:tcPr>
-            <w:tcW w:w="2740" w:type="dxa"/>
+            <w:tcW w:w="3400" w:type="dxa"/>
             <w:gridSpan w:val="2"/>
             <w:tcBorders>
-              <w:top w:val="single" w:sz="4" w:space="0" w:color="auto"/>
-              <w:left w:val="single" w:sz="4" w:space="0" w:color="auto"/>
-              <w:bottom w:val="single" w:sz="4" w:space="0" w:color="auto"/>
-              <w:right w:val="single" w:sz="4" w:space="0" w:color="auto"/>
+              <w:top w:val="single" w:sz="8" w:space="0" w:color="auto"/>
+              <w:left w:val="single" w:sz="8" w:space="0" w:color="auto"/>
+              <w:bottom w:val="single" w:sz="8" w:space="0" w:color="auto"/>
+              <w:right w:val="single" w:sz="8" w:space="0" w:color="000000"/>
             </w:tcBorders>
             <w:noWrap/>
-            <w:vAlign w:val="bottom"/>
+            <w:vAlign w:val="center"/>
             <w:hideMark/>
           </w:tcPr>
           <w:p>
@@ -1639,16 +1610,16 @@
         </w:tc>
         <w:tc>
           <w:tcPr>
-            <w:tcW w:w="4401" w:type="dxa"/>
+            <w:tcW w:w="6340" w:type="dxa"/>
             <w:gridSpan w:val="3"/>
             <w:tcBorders>
-              <w:top w:val="single" w:sz="4" w:space="0" w:color="auto"/>
+              <w:top w:val="single" w:sz="8" w:space="0" w:color="auto"/>
               <w:left w:val="nil"/>
-              <w:bottom w:val="single" w:sz="4" w:space="0" w:color="auto"/>
-              <w:right w:val="single" w:sz="4" w:space="0" w:color="auto"/>
+              <w:bottom w:val="single" w:sz="8" w:space="0" w:color="auto"/>
+              <w:right w:val="single" w:sz="8" w:space="0" w:color="000000"/>
             </w:tcBorders>
             <w:noWrap/>
-            <w:vAlign w:val="bottom"/>
+            <w:vAlign w:val="center"/>
             <w:hideMark/>
           </w:tcPr>
           <w:p>
@@ -1676,20 +1647,19 @@
       </w:tr>
       <w:tr>
         <w:trPr>
-          <w:trHeight w:val="270"/>
-          <w:jc w:val="center"/>
+          <w:trHeight w:val="300"/>
         </w:trPr>
         <w:tc>
           <w:tcPr>
-            <w:tcW w:w="1280" w:type="dxa"/>
+            <w:tcW w:w="1700" w:type="dxa"/>
             <w:tcBorders>
               <w:top w:val="nil"/>
-              <w:left w:val="single" w:sz="4" w:space="0" w:color="auto"/>
-              <w:bottom w:val="single" w:sz="4" w:space="0" w:color="auto"/>
-              <w:right w:val="single" w:sz="4" w:space="0" w:color="auto"/>
+              <w:left w:val="single" w:sz="8" w:space="0" w:color="auto"/>
+              <w:bottom w:val="single" w:sz="8" w:space="0" w:color="auto"/>
+              <w:right w:val="single" w:sz="8" w:space="0" w:color="auto"/>
             </w:tcBorders>
             <w:noWrap/>
-            <w:vAlign w:val="bottom"/>
+            <w:vAlign w:val="center"/>
             <w:hideMark/>
           </w:tcPr>
           <w:p>
@@ -1712,15 +1682,15 @@
         </w:tc>
         <w:tc>
           <w:tcPr>
-            <w:tcW w:w="1460" w:type="dxa"/>
+            <w:tcW w:w="1700" w:type="dxa"/>
             <w:tcBorders>
               <w:top w:val="nil"/>
               <w:left w:val="nil"/>
-              <w:bottom w:val="single" w:sz="4" w:space="0" w:color="auto"/>
-              <w:right w:val="single" w:sz="4" w:space="0" w:color="auto"/>
+              <w:bottom w:val="single" w:sz="8" w:space="0" w:color="auto"/>
+              <w:right w:val="single" w:sz="8" w:space="0" w:color="auto"/>
             </w:tcBorders>
             <w:noWrap/>
-            <w:vAlign w:val="bottom"/>
+            <w:vAlign w:val="center"/>
             <w:hideMark/>
           </w:tcPr>
           <w:p>
@@ -1743,15 +1713,15 @@
         </w:tc>
         <w:tc>
           <w:tcPr>
-            <w:tcW w:w="1365" w:type="dxa"/>
+            <w:tcW w:w="1748" w:type="dxa"/>
             <w:tcBorders>
               <w:top w:val="nil"/>
               <w:left w:val="nil"/>
-              <w:bottom w:val="single" w:sz="4" w:space="0" w:color="auto"/>
-              <w:right w:val="single" w:sz="4" w:space="0" w:color="auto"/>
+              <w:bottom w:val="single" w:sz="8" w:space="0" w:color="auto"/>
+              <w:right w:val="single" w:sz="8" w:space="0" w:color="auto"/>
             </w:tcBorders>
             <w:noWrap/>
-            <w:vAlign w:val="bottom"/>
+            <w:vAlign w:val="center"/>
             <w:hideMark/>
           </w:tcPr>
           <w:p>
@@ -1774,15 +1744,15 @@
         </w:tc>
         <w:tc>
           <w:tcPr>
-            <w:tcW w:w="1038" w:type="dxa"/>
+            <w:tcW w:w="1373" w:type="dxa"/>
             <w:tcBorders>
               <w:top w:val="nil"/>
               <w:left w:val="nil"/>
-              <w:bottom w:val="single" w:sz="4" w:space="0" w:color="auto"/>
-              <w:right w:val="single" w:sz="4" w:space="0" w:color="auto"/>
+              <w:bottom w:val="single" w:sz="8" w:space="0" w:color="auto"/>
+              <w:right w:val="single" w:sz="8" w:space="0" w:color="auto"/>
             </w:tcBorders>
             <w:noWrap/>
-            <w:vAlign w:val="bottom"/>
+            <w:vAlign w:val="center"/>
             <w:hideMark/>
           </w:tcPr>
           <w:p>
@@ -1805,15 +1775,15 @@
         </w:tc>
         <w:tc>
           <w:tcPr>
-            <w:tcW w:w="1998" w:type="dxa"/>
+            <w:tcW w:w="3219" w:type="dxa"/>
             <w:tcBorders>
               <w:top w:val="nil"/>
               <w:left w:val="nil"/>
-              <w:bottom w:val="single" w:sz="4" w:space="0" w:color="auto"/>
-              <w:right w:val="single" w:sz="4" w:space="0" w:color="auto"/>
+              <w:bottom w:val="single" w:sz="8" w:space="0" w:color="auto"/>
+              <w:right w:val="single" w:sz="8" w:space="0" w:color="auto"/>
             </w:tcBorders>
             <w:noWrap/>
-            <w:vAlign w:val="bottom"/>
+            <w:vAlign w:val="center"/>
             <w:hideMark/>
           </w:tcPr>
           <w:p>
@@ -1840,19 +1810,18 @@
       <w:tr>
         <w:trPr>
           <w:trHeight w:val="300"/>
-          <w:jc w:val="center"/>
         </w:trPr>
         <w:tc>
           <w:tcPr>
-            <w:tcW w:w="1280" w:type="dxa"/>
+            <w:tcW w:w="1700" w:type="dxa"/>
             <w:tcBorders>
               <w:top w:val="nil"/>
-              <w:left w:val="single" w:sz="4" w:space="0" w:color="auto"/>
-              <w:bottom w:val="single" w:sz="4" w:space="0" w:color="auto"/>
-              <w:right w:val="single" w:sz="4" w:space="0" w:color="auto"/>
+              <w:left w:val="single" w:sz="8" w:space="0" w:color="auto"/>
+              <w:bottom w:val="single" w:sz="8" w:space="0" w:color="auto"/>
+              <w:right w:val="single" w:sz="8" w:space="0" w:color="auto"/>
             </w:tcBorders>
             <w:noWrap/>
-            <w:vAlign w:val="bottom"/>
+            <w:vAlign w:val="center"/>
             <w:hideMark/>
           </w:tcPr>
           <w:p>
@@ -1869,21 +1838,21 @@
                 <w:rFonts w:ascii="Times New Roman" w:eastAsia="Arial Unicode MS" w:hAnsi="Times New Roman"/>
                 <w:color w:val="000000"/>
               </w:rPr>
-              <w:t xml:space="preserve"> R$    100,00 </w:t>
+              <w:t>R$ 100,00</w:t>
             </w:r>
           </w:p>
         </w:tc>
         <w:tc>
           <w:tcPr>
-            <w:tcW w:w="1460" w:type="dxa"/>
+            <w:tcW w:w="1700" w:type="dxa"/>
             <w:tcBorders>
               <w:top w:val="nil"/>
               <w:left w:val="nil"/>
-              <w:bottom w:val="single" w:sz="4" w:space="0" w:color="auto"/>
-              <w:right w:val="single" w:sz="4" w:space="0" w:color="auto"/>
+              <w:bottom w:val="single" w:sz="8" w:space="0" w:color="auto"/>
+              <w:right w:val="single" w:sz="8" w:space="0" w:color="auto"/>
             </w:tcBorders>
             <w:noWrap/>
-            <w:vAlign w:val="bottom"/>
+            <w:vAlign w:val="center"/>
             <w:hideMark/>
           </w:tcPr>
           <w:p>
@@ -1900,21 +1869,21 @@
                 <w:rFonts w:ascii="Times New Roman" w:eastAsia="Times New Roman" w:hAnsi="Times New Roman"/>
                 <w:color w:val="000000"/>
               </w:rPr>
-              <w:t xml:space="preserve"> R$       200,00 </w:t>
+              <w:t>R$ 200,00</w:t>
             </w:r>
           </w:p>
         </w:tc>
         <w:tc>
           <w:tcPr>
-            <w:tcW w:w="1365" w:type="dxa"/>
+            <w:tcW w:w="1748" w:type="dxa"/>
             <w:tcBorders>
               <w:top w:val="nil"/>
               <w:left w:val="nil"/>
-              <w:bottom w:val="single" w:sz="4" w:space="0" w:color="auto"/>
-              <w:right w:val="single" w:sz="4" w:space="0" w:color="auto"/>
+              <w:bottom w:val="single" w:sz="8" w:space="0" w:color="auto"/>
+              <w:right w:val="single" w:sz="8" w:space="0" w:color="auto"/>
             </w:tcBorders>
             <w:noWrap/>
-            <w:vAlign w:val="bottom"/>
+            <w:vAlign w:val="center"/>
             <w:hideMark/>
           </w:tcPr>
           <w:p>
@@ -1937,15 +1906,15 @@
         </w:tc>
         <w:tc>
           <w:tcPr>
-            <w:tcW w:w="1038" w:type="dxa"/>
+            <w:tcW w:w="1373" w:type="dxa"/>
             <w:tcBorders>
               <w:top w:val="nil"/>
               <w:left w:val="nil"/>
-              <w:bottom w:val="single" w:sz="4" w:space="0" w:color="auto"/>
-              <w:right w:val="single" w:sz="4" w:space="0" w:color="auto"/>
+              <w:bottom w:val="single" w:sz="8" w:space="0" w:color="auto"/>
+              <w:right w:val="single" w:sz="8" w:space="0" w:color="auto"/>
             </w:tcBorders>
             <w:noWrap/>
-            <w:vAlign w:val="bottom"/>
+            <w:vAlign w:val="center"/>
             <w:hideMark/>
           </w:tcPr>
           <w:p>
@@ -1962,21 +1931,21 @@
                 <w:rFonts w:ascii="Times New Roman" w:eastAsia="Times New Roman" w:hAnsi="Times New Roman"/>
                 <w:color w:val="000000"/>
               </w:rPr>
-              <w:t xml:space="preserve"> R$ 33,33 </w:t>
+              <w:t>R$ 33,33</w:t>
             </w:r>
           </w:p>
         </w:tc>
         <w:tc>
           <w:tcPr>
-            <w:tcW w:w="1998" w:type="dxa"/>
+            <w:tcW w:w="3219" w:type="dxa"/>
             <w:tcBorders>
               <w:top w:val="nil"/>
               <w:left w:val="nil"/>
-              <w:bottom w:val="single" w:sz="4" w:space="0" w:color="auto"/>
-              <w:right w:val="single" w:sz="4" w:space="0" w:color="auto"/>
+              <w:bottom w:val="single" w:sz="8" w:space="0" w:color="auto"/>
+              <w:right w:val="single" w:sz="8" w:space="0" w:color="auto"/>
             </w:tcBorders>
             <w:noWrap/>
-            <w:vAlign w:val="bottom"/>
+            <w:vAlign w:val="center"/>
             <w:hideMark/>
           </w:tcPr>
           <w:p>
@@ -1993,7 +1962,7 @@
                 <w:rFonts w:ascii="Times New Roman" w:eastAsia="Times New Roman" w:hAnsi="Times New Roman"/>
                 <w:color w:val="000000"/>
               </w:rPr>
-              <w:t xml:space="preserve"> R$                66,66 </w:t>
+              <w:t>R$ 66,66</w:t>
             </w:r>
           </w:p>
         </w:tc>
@@ -2001,19 +1970,18 @@
       <w:tr>
         <w:trPr>
           <w:trHeight w:val="300"/>
-          <w:jc w:val="center"/>
         </w:trPr>
         <w:tc>
           <w:tcPr>
-            <w:tcW w:w="1280" w:type="dxa"/>
+            <w:tcW w:w="1700" w:type="dxa"/>
             <w:tcBorders>
               <w:top w:val="nil"/>
-              <w:left w:val="single" w:sz="4" w:space="0" w:color="auto"/>
-              <w:bottom w:val="single" w:sz="4" w:space="0" w:color="auto"/>
-              <w:right w:val="single" w:sz="4" w:space="0" w:color="auto"/>
+              <w:left w:val="single" w:sz="8" w:space="0" w:color="auto"/>
+              <w:bottom w:val="single" w:sz="8" w:space="0" w:color="auto"/>
+              <w:right w:val="single" w:sz="8" w:space="0" w:color="auto"/>
             </w:tcBorders>
             <w:noWrap/>
-            <w:vAlign w:val="bottom"/>
+            <w:vAlign w:val="center"/>
             <w:hideMark/>
           </w:tcPr>
           <w:p>
@@ -2030,21 +1998,21 @@
                 <w:rFonts w:ascii="Times New Roman" w:eastAsia="Arial Unicode MS" w:hAnsi="Times New Roman"/>
                 <w:color w:val="000000"/>
               </w:rPr>
-              <w:t xml:space="preserve"> R$    201,00 </w:t>
+              <w:t>R$ 201,00</w:t>
             </w:r>
           </w:p>
         </w:tc>
         <w:tc>
           <w:tcPr>
-            <w:tcW w:w="1460" w:type="dxa"/>
+            <w:tcW w:w="1700" w:type="dxa"/>
             <w:tcBorders>
               <w:top w:val="nil"/>
               <w:left w:val="nil"/>
-              <w:bottom w:val="single" w:sz="4" w:space="0" w:color="auto"/>
-              <w:right w:val="single" w:sz="4" w:space="0" w:color="auto"/>
+              <w:bottom w:val="single" w:sz="8" w:space="0" w:color="auto"/>
+              <w:right w:val="single" w:sz="8" w:space="0" w:color="auto"/>
             </w:tcBorders>
             <w:noWrap/>
-            <w:vAlign w:val="bottom"/>
+            <w:vAlign w:val="center"/>
             <w:hideMark/>
           </w:tcPr>
           <w:p>
@@ -2061,21 +2029,21 @@
                 <w:rFonts w:ascii="Times New Roman" w:eastAsia="Times New Roman" w:hAnsi="Times New Roman"/>
                 <w:color w:val="000000"/>
               </w:rPr>
-              <w:t xml:space="preserve"> R$       400,00 </w:t>
+              <w:t>R$ 400,00</w:t>
             </w:r>
           </w:p>
         </w:tc>
         <w:tc>
           <w:tcPr>
-            <w:tcW w:w="1365" w:type="dxa"/>
+            <w:tcW w:w="1748" w:type="dxa"/>
             <w:tcBorders>
               <w:top w:val="nil"/>
               <w:left w:val="nil"/>
-              <w:bottom w:val="single" w:sz="4" w:space="0" w:color="auto"/>
-              <w:right w:val="single" w:sz="4" w:space="0" w:color="auto"/>
+              <w:bottom w:val="single" w:sz="8" w:space="0" w:color="auto"/>
+              <w:right w:val="single" w:sz="8" w:space="0" w:color="auto"/>
             </w:tcBorders>
             <w:noWrap/>
-            <w:vAlign w:val="bottom"/>
+            <w:vAlign w:val="center"/>
             <w:hideMark/>
           </w:tcPr>
           <w:p>
@@ -2098,15 +2066,15 @@
         </w:tc>
         <w:tc>
           <w:tcPr>
-            <w:tcW w:w="1038" w:type="dxa"/>
+            <w:tcW w:w="1373" w:type="dxa"/>
             <w:tcBorders>
               <w:top w:val="nil"/>
               <w:left w:val="nil"/>
-              <w:bottom w:val="single" w:sz="4" w:space="0" w:color="auto"/>
-              <w:right w:val="single" w:sz="4" w:space="0" w:color="auto"/>
+              <w:bottom w:val="single" w:sz="8" w:space="0" w:color="auto"/>
+              <w:right w:val="single" w:sz="8" w:space="0" w:color="auto"/>
             </w:tcBorders>
             <w:noWrap/>
-            <w:vAlign w:val="bottom"/>
+            <w:vAlign w:val="center"/>
             <w:hideMark/>
           </w:tcPr>
           <w:p>
@@ -2123,21 +2091,21 @@
                 <w:rFonts w:ascii="Times New Roman" w:eastAsia="Times New Roman" w:hAnsi="Times New Roman"/>
                 <w:color w:val="000000"/>
               </w:rPr>
-              <w:t xml:space="preserve"> R$ 40,20 </w:t>
+              <w:t>R$ 40,20</w:t>
             </w:r>
           </w:p>
         </w:tc>
         <w:tc>
           <w:tcPr>
-            <w:tcW w:w="1998" w:type="dxa"/>
+            <w:tcW w:w="3219" w:type="dxa"/>
             <w:tcBorders>
               <w:top w:val="nil"/>
               <w:left w:val="nil"/>
-              <w:bottom w:val="single" w:sz="4" w:space="0" w:color="auto"/>
-              <w:right w:val="single" w:sz="4" w:space="0" w:color="auto"/>
+              <w:bottom w:val="single" w:sz="8" w:space="0" w:color="auto"/>
+              <w:right w:val="single" w:sz="8" w:space="0" w:color="auto"/>
             </w:tcBorders>
             <w:noWrap/>
-            <w:vAlign w:val="bottom"/>
+            <w:vAlign w:val="center"/>
             <w:hideMark/>
           </w:tcPr>
           <w:p>
@@ -2154,7 +2122,7 @@
                 <w:rFonts w:ascii="Times New Roman" w:eastAsia="Times New Roman" w:hAnsi="Times New Roman"/>
                 <w:color w:val="000000"/>
               </w:rPr>
-              <w:t xml:space="preserve"> R$                80,00 </w:t>
+              <w:t>R$ 80,00</w:t>
             </w:r>
           </w:p>
         </w:tc>
@@ -2162,19 +2130,18 @@
       <w:tr>
         <w:trPr>
           <w:trHeight w:val="300"/>
-          <w:jc w:val="center"/>
         </w:trPr>
         <w:tc>
           <w:tcPr>
-            <w:tcW w:w="1280" w:type="dxa"/>
+            <w:tcW w:w="1700" w:type="dxa"/>
             <w:tcBorders>
               <w:top w:val="nil"/>
-              <w:left w:val="single" w:sz="4" w:space="0" w:color="auto"/>
-              <w:bottom w:val="single" w:sz="4" w:space="0" w:color="auto"/>
-              <w:right w:val="single" w:sz="4" w:space="0" w:color="auto"/>
+              <w:left w:val="single" w:sz="8" w:space="0" w:color="auto"/>
+              <w:bottom w:val="single" w:sz="8" w:space="0" w:color="auto"/>
+              <w:right w:val="single" w:sz="8" w:space="0" w:color="auto"/>
             </w:tcBorders>
             <w:noWrap/>
-            <w:vAlign w:val="bottom"/>
+            <w:vAlign w:val="center"/>
             <w:hideMark/>
           </w:tcPr>
           <w:p>
@@ -2191,21 +2158,21 @@
                 <w:rFonts w:ascii="Times New Roman" w:eastAsia="Arial Unicode MS" w:hAnsi="Times New Roman"/>
                 <w:color w:val="000000"/>
               </w:rPr>
-              <w:t xml:space="preserve"> R$    401,00 </w:t>
+              <w:t>R$ 401,00</w:t>
             </w:r>
           </w:p>
         </w:tc>
         <w:tc>
           <w:tcPr>
-            <w:tcW w:w="1460" w:type="dxa"/>
+            <w:tcW w:w="1700" w:type="dxa"/>
             <w:tcBorders>
               <w:top w:val="nil"/>
               <w:left w:val="nil"/>
-              <w:bottom w:val="single" w:sz="4" w:space="0" w:color="auto"/>
-              <w:right w:val="single" w:sz="4" w:space="0" w:color="auto"/>
+              <w:bottom w:val="single" w:sz="8" w:space="0" w:color="auto"/>
+              <w:right w:val="single" w:sz="8" w:space="0" w:color="auto"/>
             </w:tcBorders>
             <w:noWrap/>
-            <w:vAlign w:val="bottom"/>
+            <w:vAlign w:val="center"/>
             <w:hideMark/>
           </w:tcPr>
           <w:p>
@@ -2228,15 +2195,15 @@
         </w:tc>
         <w:tc>
           <w:tcPr>
-            <w:tcW w:w="1365" w:type="dxa"/>
+            <w:tcW w:w="1748" w:type="dxa"/>
             <w:tcBorders>
               <w:top w:val="nil"/>
               <w:left w:val="nil"/>
-              <w:bottom w:val="single" w:sz="4" w:space="0" w:color="auto"/>
-              <w:right w:val="single" w:sz="4" w:space="0" w:color="auto"/>
+              <w:bottom w:val="single" w:sz="8" w:space="0" w:color="auto"/>
+              <w:right w:val="single" w:sz="8" w:space="0" w:color="auto"/>
             </w:tcBorders>
             <w:noWrap/>
-            <w:vAlign w:val="bottom"/>
+            <w:vAlign w:val="center"/>
             <w:hideMark/>
           </w:tcPr>
           <w:p>
@@ -2259,15 +2226,15 @@
         </w:tc>
         <w:tc>
           <w:tcPr>
-            <w:tcW w:w="1038" w:type="dxa"/>
+            <w:tcW w:w="1373" w:type="dxa"/>
             <w:tcBorders>
               <w:top w:val="nil"/>
               <w:left w:val="nil"/>
-              <w:bottom w:val="single" w:sz="4" w:space="0" w:color="auto"/>
-              <w:right w:val="single" w:sz="4" w:space="0" w:color="auto"/>
+              <w:bottom w:val="single" w:sz="8" w:space="0" w:color="auto"/>
+              <w:right w:val="single" w:sz="8" w:space="0" w:color="auto"/>
             </w:tcBorders>
             <w:noWrap/>
-            <w:vAlign w:val="bottom"/>
+            <w:vAlign w:val="center"/>
             <w:hideMark/>
           </w:tcPr>
           <w:p>
@@ -2284,21 +2251,21 @@
                 <w:rFonts w:ascii="Times New Roman" w:eastAsia="Times New Roman" w:hAnsi="Times New Roman"/>
                 <w:color w:val="000000"/>
               </w:rPr>
-              <w:t xml:space="preserve"> R$ 50,12 </w:t>
+              <w:t>R$ 50,12</w:t>
             </w:r>
           </w:p>
         </w:tc>
         <w:tc>
           <w:tcPr>
-            <w:tcW w:w="1998" w:type="dxa"/>
+            <w:tcW w:w="3219" w:type="dxa"/>
             <w:tcBorders>
               <w:top w:val="nil"/>
               <w:left w:val="nil"/>
-              <w:bottom w:val="single" w:sz="4" w:space="0" w:color="auto"/>
-              <w:right w:val="single" w:sz="4" w:space="0" w:color="auto"/>
+              <w:bottom w:val="single" w:sz="8" w:space="0" w:color="auto"/>
+              <w:right w:val="single" w:sz="8" w:space="0" w:color="auto"/>
             </w:tcBorders>
             <w:noWrap/>
-            <w:vAlign w:val="bottom"/>
+            <w:vAlign w:val="center"/>
             <w:hideMark/>
           </w:tcPr>
           <w:p>
@@ -2315,7 +2282,7 @@
                 <w:rFonts w:ascii="Times New Roman" w:eastAsia="Times New Roman" w:hAnsi="Times New Roman"/>
                 <w:color w:val="000000"/>
               </w:rPr>
-              <w:t xml:space="preserve"> {{</w:t>
+              <w:t>R$ {{</w:t>
             </w:r>
             <w:proofErr w:type="spellStart"/>
             <w:r>
@@ -2331,7 +2298,7 @@
                 <w:rFonts w:ascii="Times New Roman" w:eastAsia="Times New Roman" w:hAnsi="Times New Roman"/>
                 <w:color w:val="000000"/>
               </w:rPr>
-              <w:t xml:space="preserve">}} </w:t>
+              <w:t>}}</w:t>
             </w:r>
           </w:p>
         </w:tc>
@@ -2379,7 +2346,6 @@
           <w:sz w:val="22"/>
           <w:szCs w:val="22"/>
         </w:rPr>
-        <w:lastRenderedPageBreak/>
         <w:t>* Em caso de Smartphone novo será considerado o preço de reposição.</w:t>
       </w:r>
     </w:p>
@@ -2568,7 +2534,33 @@
         <w:rPr>
           <w:rFonts w:ascii="Times New Roman" w:hAnsi="Times New Roman"/>
         </w:rPr>
-        <w:t>Passo Fundo, {{dia}} de {{mês}} de {{ano}}</w:t>
+        <w:t>Passo Fundo, {{dia}} de {{</w:t>
+      </w:r>
+      <w:proofErr w:type="spellStart"/>
+      <w:r>
+        <w:rPr>
+          <w:rFonts w:ascii="Times New Roman" w:hAnsi="Times New Roman"/>
+        </w:rPr>
+        <w:t>m</w:t>
+      </w:r>
+      <w:r>
+        <w:rPr>
+          <w:rFonts w:ascii="Times New Roman" w:hAnsi="Times New Roman"/>
+        </w:rPr>
+        <w:t>e</w:t>
+      </w:r>
+      <w:r>
+        <w:rPr>
+          <w:rFonts w:ascii="Times New Roman" w:hAnsi="Times New Roman"/>
+        </w:rPr>
+        <w:t>s</w:t>
+      </w:r>
+      <w:proofErr w:type="spellEnd"/>
+      <w:r>
+        <w:rPr>
+          <w:rFonts w:ascii="Times New Roman" w:hAnsi="Times New Roman"/>
+        </w:rPr>
+        <w:t>}} de {{ano}}</w:t>
       </w:r>
     </w:p>
     <w:sectPr>

</xml_diff>